<commit_message>
Improve B paper for judging
</commit_message>
<xml_diff>
--- a/2026_B题/outputs/B题_多源融合机器人定位及任务优化_论文.docx
+++ b/2026_B题/outputs/B题_多源融合机器人定位及任务优化_论文.docx
@@ -29,7 +29,6 @@
           <w:rFonts w:ascii="宋体" w:hAnsi="宋体"/>
           <w:sz w:val="24"/>
         </w:rPr>
-        <w:br/>
         <w:t>针对两种异频异步定位方式，本文建立“时间平移—固定偏差估计—10Hz重采样融合”的多源定位模型。问题1在无噪声条件下，以方式1为基准得到方式2相对时间偏差为 198.4317s，时间平移后两轨迹均方残差接近0。问题2在随机噪声和固定系统偏差并存条件下，估计方式2相对时间偏差为 50.5731s，95%置信区间为 [50.5679,50.5762]s，方式2相对方式1的固定坐标偏差为 (3.4923,-1.8225)m。问题3实测数据中，带偏差模型候选偏差为 (-0.1495,-0.2095)m，误差下降比例为 1.65%；尽管大样本F检验可检出微小均值漂移（F=25.17, p=1.44e-11），但其幅值和误差改善均低于工程效应量阈值，因此不采用固定系统偏差修正。问题4在附件3融合轨迹上生成可行任务候选，并用0-1整数规划最大化期望完成数，得到 18 项非重叠任务，其中模拟射击 5 项、拍照 13 项，期望完成数为 17.25。全部任务满足距离、速度、加速度、准备时间和拍照角度约束。</w:t>
       </w:r>
     </w:p>
@@ -42,12 +41,7 @@
           <w:rFonts w:ascii="宋体" w:hAnsi="宋体"/>
           <w:sz w:val="24"/>
         </w:rPr>
-        <w:t>关键词：多源定位；时间同步；系统偏差；10Hz重采样；整数规划；任务优化</w:t>
-      </w:r>
-    </w:p>
-    <w:p>
-      <w:r>
-        <w:br w:type="page"/>
+        <w:t>关键词： 多源定位；时间同步；系统偏差；10Hz重采样；整数规划；任务优化</w:t>
       </w:r>
     </w:p>
     <w:p>
@@ -55,7 +49,7 @@
         <w:pStyle w:val="Heading1"/>
       </w:pPr>
       <w:r>
-        <w:t>一、问题重述</w:t>
+        <w:t>1 问题重述</w:t>
       </w:r>
     </w:p>
     <w:p>
@@ -68,7 +62,7 @@
           <w:rFonts w:ascii="宋体" w:hAnsi="宋体"/>
           <w:sz w:val="24"/>
         </w:rPr>
-        <w:t>两种定位方式存在启动时间不同、采样频率不同、随机噪声和可能的固定系统偏差。本文分别完成时间对齐、系统偏差判断、10Hz融合轨迹输出，并基于附件3轨迹优化射击和拍照任务。</w:t>
+        <w:t>题目给出定位方式1（4Hz）和定位方式2（5Hz）两组二维定位数据。两种方式存在采样频率不同、启动时间不同、随机噪声以及可能的固定系统偏差。问题1要求在无噪声情形下完成时间对齐并输出10Hz轨迹；问题2要求在噪声和系统偏差下同时估计时间偏差、坐标偏差并输出10Hz轨迹；问题3要求对实测数据判断是否存在系统偏差并完成融合；问题4要求机器人沿附件3轨迹运动时，在题面附录约束下尽可能多地完成模拟射击和拍照扫描任务，并填写结果表。</w:t>
       </w:r>
     </w:p>
     <w:p>
@@ -76,7 +70,7 @@
         <w:pStyle w:val="Heading1"/>
       </w:pPr>
       <w:r>
-        <w:t>二、模型与算法</w:t>
+        <w:t>2 模型假设</w:t>
       </w:r>
     </w:p>
     <w:p>
@@ -89,15 +83,7 @@
           <w:rFonts w:ascii="宋体" w:hAnsi="宋体"/>
           <w:sz w:val="24"/>
         </w:rPr>
-        <w:t>以方式1为基准，对方式2估计时间平移delta和固定坐标偏差b。对齐目标函数采用重叠区间插值后的截尾均方误差；系统偏差判定同时考虑F检验和工程效应量。任务优化阶段先生成可行候选，再用0-1整数规划最大化期望完成数。</w:t>
-      </w:r>
-    </w:p>
-    <w:p>
-      <w:pPr>
-        <w:pStyle w:val="Heading1"/>
-      </w:pPr>
-      <w:r>
-        <w:t>三、主要结果</w:t>
+        <w:t>1. 方式1作为时间基准，方式2经时间平移后为 $\tau=t_2-\delta$。</w:t>
       </w:r>
     </w:p>
     <w:p>
@@ -110,7 +96,46 @@
           <w:rFonts w:ascii="宋体" w:hAnsi="宋体"/>
           <w:sz w:val="24"/>
         </w:rPr>
-        <w:t>时间偏差、系统偏差、10Hz轨迹和任务调度明细均已输出到outputs目录。问题4共选出10项非重叠任务，期望完成数为9.55。</w:t>
+        <w:t>2. 若存在固定系统偏差，则方式2修正坐标为 $p_2'=p_2-b$，其中 $b=(b_x,b_y)$。</w:t>
+      </w:r>
+    </w:p>
+    <w:p>
+      <w:pPr>
+        <w:spacing w:line="240" w:lineRule="auto"/>
+        <w:ind w:firstLine="480"/>
+      </w:pPr>
+      <w:r>
+        <w:rPr>
+          <w:rFonts w:ascii="宋体" w:hAnsi="宋体"/>
+          <w:sz w:val="24"/>
+        </w:rPr>
+        <w:t>3. 两方式在重叠时间区间内描述同一条实际轨迹；融合输出采用10Hz网格。</w:t>
+      </w:r>
+    </w:p>
+    <w:p>
+      <w:pPr>
+        <w:spacing w:line="240" w:lineRule="auto"/>
+        <w:ind w:firstLine="480"/>
+      </w:pPr>
+      <w:r>
+        <w:rPr>
+          <w:rFonts w:ascii="宋体" w:hAnsi="宋体"/>
+          <w:sz w:val="24"/>
+        </w:rPr>
+        <w:t>4. 问题4中同一时段机器人只能准备或执行一项任务，因此任务区间不能重叠；射击目标最多执行一次，拍照目标可从多个方向拍摄，但同一目标任意两次拍照方向角差至少60度。</w:t>
+      </w:r>
+    </w:p>
+    <w:p>
+      <w:pPr>
+        <w:spacing w:line="240" w:lineRule="auto"/>
+        <w:ind w:firstLine="480"/>
+      </w:pPr>
+      <w:r>
+        <w:rPr>
+          <w:rFonts w:ascii="宋体" w:hAnsi="宋体"/>
+          <w:sz w:val="24"/>
+        </w:rPr>
+        <w:t>5. 题面未给出额外冷却时间或任务优先级，故优化目标取为最大化期望完成数：拍照权重1，模拟射击权重0.85。</w:t>
       </w:r>
     </w:p>
     <w:p>
@@ -118,7 +143,655 @@
         <w:pStyle w:val="Heading1"/>
       </w:pPr>
       <w:r>
-        <w:t>四、图表</w:t>
+        <w:t>3 时间对齐与偏差估计模型</w:t>
+      </w:r>
+    </w:p>
+    <w:p>
+      <w:pPr>
+        <w:spacing w:line="240" w:lineRule="auto"/>
+        <w:ind w:firstLine="480"/>
+      </w:pPr>
+      <w:r>
+        <w:rPr>
+          <w:rFonts w:ascii="宋体" w:hAnsi="宋体"/>
+          <w:sz w:val="24"/>
+        </w:rPr>
+        <w:t>对给定 $\delta$，先将方式2时间修正为 $t_2-\delta$，再在两条轨迹的重叠区间按0.1s网格插值，得到 $q_1(t)$ 与 $q_2(t-\delta)$。若重叠时长过短，局部形状相似会造成伪匹配，因此搜索时要求重叠时长不低于较短轨迹时长的85%。无偏模型最小化</w:t>
+      </w:r>
+    </w:p>
+    <w:p>
+      <w:pPr>
+        <w:jc w:val="center"/>
+      </w:pPr>
+      <w:r>
+        <w:t>J_0(\delta)=\frac1n\sum_t \|q_2(t-\delta)-q_1(t)\|^2 .</w:t>
+      </w:r>
+    </w:p>
+    <w:p>
+      <w:pPr>
+        <w:spacing w:line="240" w:lineRule="auto"/>
+        <w:ind w:firstLine="480"/>
+      </w:pPr>
+      <w:r>
+        <w:rPr>
+          <w:rFonts w:ascii="宋体" w:hAnsi="宋体"/>
+          <w:sz w:val="24"/>
+        </w:rPr>
+        <w:t>带偏模型在每个候选 $\delta$ 下用坐标差的中位数估计固定偏差</w:t>
+      </w:r>
+    </w:p>
+    <w:p>
+      <w:pPr>
+        <w:jc w:val="center"/>
+      </w:pPr>
+      <w:r>
+        <w:t>\hat b(\delta)=\operatorname{median}_t\,[q_2(t-\delta)-q_1(t)],</w:t>
+      </w:r>
+    </w:p>
+    <w:p>
+      <w:pPr>
+        <w:spacing w:line="240" w:lineRule="auto"/>
+        <w:ind w:firstLine="480"/>
+      </w:pPr>
+      <w:r>
+        <w:rPr>
+          <w:rFonts w:ascii="宋体" w:hAnsi="宋体"/>
+          <w:sz w:val="24"/>
+        </w:rPr>
+        <w:t>并最小化截尾均方误差</w:t>
+      </w:r>
+    </w:p>
+    <w:p>
+      <w:pPr>
+        <w:jc w:val="center"/>
+      </w:pPr>
+      <w:r>
+        <w:t>J_1(\delta)=\frac1n\sum_t \|q_2(t-\delta)-q_1(t)-\hat b(\delta)\|^2 .</w:t>
+      </w:r>
+    </w:p>
+    <w:p>
+      <w:pPr>
+        <w:spacing w:line="240" w:lineRule="auto"/>
+        <w:ind w:firstLine="480"/>
+      </w:pPr>
+      <w:r>
+        <w:rPr>
+          <w:rFonts w:ascii="宋体" w:hAnsi="宋体"/>
+          <w:sz w:val="24"/>
+        </w:rPr>
+        <w:t>实际求解时先在允许区间内粗搜索，再用有界一维优化细化 $\delta$。对问题2、问题3，本文比较无偏模型和带偏模型的残差平方和，采用嵌套模型F检验判断固定偏差项是否具有统计显著性。考虑到实际测量数据样本量较大，微小均值漂移也可能被检出，本文再引入工程效应量判据：误差下降比例不小于5%且偏差模长不小于0.5m时，才采用固定偏差修正。这样可以避免把随机噪声或微小漂移解释成需要修正的系统误差。</w:t>
+      </w:r>
+    </w:p>
+    <w:p>
+      <w:pPr>
+        <w:spacing w:line="240" w:lineRule="auto"/>
+        <w:ind w:firstLine="480"/>
+      </w:pPr>
+      <w:r>
+        <w:rPr>
+          <w:rFonts w:ascii="宋体" w:hAnsi="宋体"/>
+          <w:sz w:val="24"/>
+        </w:rPr>
+        <w:t>时间偏差置信区间采用残差重采样的线性化估计。对最优解附近，$\delta$ 的微小变化等价于沿方式2局部速度方向扰动轨迹，因此可由重采样残差和局部速度的最小二乘关系得到 $\delta$ 的扰动分布，并取2.5%和97.5%分位数作为95%置信区间。</w:t>
+      </w:r>
+    </w:p>
+    <w:p>
+      <w:pPr>
+        <w:pStyle w:val="Heading1"/>
+      </w:pPr>
+      <w:r>
+        <w:t>4 10Hz轨迹融合</w:t>
+      </w:r>
+    </w:p>
+    <w:p>
+      <w:pPr>
+        <w:spacing w:line="240" w:lineRule="auto"/>
+        <w:ind w:firstLine="480"/>
+      </w:pPr>
+      <w:r>
+        <w:rPr>
+          <w:rFonts w:ascii="宋体" w:hAnsi="宋体"/>
+          <w:sz w:val="24"/>
+        </w:rPr>
+        <w:t>在修正后的公共时间区间上，以0.1s为步长重采样两种定位方式。融合位置为</w:t>
+      </w:r>
+    </w:p>
+    <w:p>
+      <w:pPr>
+        <w:jc w:val="center"/>
+      </w:pPr>
+      <w:r>
+        <w:t>p_f(t)=\frac12\left(q_1(t)+q_2(t-\delta)-\hat b\right).</w:t>
+      </w:r>
+    </w:p>
+    <w:p>
+      <w:pPr>
+        <w:spacing w:line="240" w:lineRule="auto"/>
+        <w:ind w:firstLine="480"/>
+      </w:pPr>
+      <w:r>
+        <w:rPr>
+          <w:rFonts w:ascii="宋体" w:hAnsi="宋体"/>
+          <w:sz w:val="24"/>
+        </w:rPr>
+        <w:t>含噪数据的速度和加速度由Savitzky-Golay平滑后的轨迹差分估计，用于问题4任务约束检查。</w:t>
+      </w:r>
+    </w:p>
+    <w:p>
+      <w:pPr>
+        <w:pStyle w:val="Heading1"/>
+      </w:pPr>
+      <w:r>
+        <w:t>5 任务优化模型</w:t>
+      </w:r>
+    </w:p>
+    <w:p>
+      <w:pPr>
+        <w:spacing w:line="240" w:lineRule="auto"/>
+        <w:ind w:firstLine="480"/>
+      </w:pPr>
+      <w:r>
+        <w:rPr>
+          <w:rFonts w:ascii="宋体" w:hAnsi="宋体"/>
+          <w:sz w:val="24"/>
+        </w:rPr>
+        <w:t>对每个候选目标逐时刻检查距离、速度、加速度约束，并用滚动窗口保证准备区间内约束全部成立。射击任务准备时长为1.5s，拍照任务准备时长为0.5s。对拍照目标，方向角由机器人指向目标点的向量计算；同一目标的任意两次拍照若方向角差小于60度，则不能同时选择。</w:t>
+      </w:r>
+    </w:p>
+    <w:p>
+      <w:pPr>
+        <w:spacing w:line="240" w:lineRule="auto"/>
+        <w:ind w:firstLine="480"/>
+      </w:pPr>
+      <w:r>
+        <w:rPr>
+          <w:rFonts w:ascii="宋体" w:hAnsi="宋体"/>
+          <w:sz w:val="24"/>
+        </w:rPr>
+        <w:t>候选任务 $i$ 具有准备开始时间 $s_i$、执行时间 $e_i$ 和期望收益 $w_i$。拍照任务成功收益取1，模拟射击任务按85%命中率取期望收益0.85。建立0-1整数规划：</w:t>
+      </w:r>
+    </w:p>
+    <w:p>
+      <w:pPr>
+        <w:jc w:val="center"/>
+      </w:pPr>
+      <w:r>
+        <w:t>\max \sum_i w_i x_i</w:t>
+      </w:r>
+    </w:p>
+    <w:p>
+      <w:pPr>
+        <w:spacing w:line="240" w:lineRule="auto"/>
+        <w:ind w:firstLine="480"/>
+      </w:pPr>
+      <w:r>
+        <w:rPr>
+          <w:rFonts w:ascii="宋体" w:hAnsi="宋体"/>
+          <w:sz w:val="24"/>
+        </w:rPr>
+        <w:t>约束包括：</w:t>
+      </w:r>
+    </w:p>
+    <w:p>
+      <w:pPr>
+        <w:spacing w:line="240" w:lineRule="auto"/>
+        <w:ind w:firstLine="480"/>
+      </w:pPr>
+      <w:r>
+        <w:rPr>
+          <w:rFonts w:ascii="宋体" w:hAnsi="宋体"/>
+          <w:sz w:val="24"/>
+        </w:rPr>
+        <w:t>1. 任意两个准备/执行区间重叠的任务不能同时选择，$x_i+x_j\le1$。</w:t>
+      </w:r>
+    </w:p>
+    <w:p>
+      <w:pPr>
+        <w:spacing w:line="240" w:lineRule="auto"/>
+        <w:ind w:firstLine="480"/>
+      </w:pPr>
+      <w:r>
+        <w:rPr>
+          <w:rFonts w:ascii="宋体" w:hAnsi="宋体"/>
+          <w:sz w:val="24"/>
+        </w:rPr>
+        <w:t>2. 同一射击目标最多执行一次。</w:t>
+      </w:r>
+    </w:p>
+    <w:p>
+      <w:pPr>
+        <w:spacing w:line="240" w:lineRule="auto"/>
+        <w:ind w:firstLine="480"/>
+      </w:pPr>
+      <w:r>
+        <w:rPr>
+          <w:rFonts w:ascii="宋体" w:hAnsi="宋体"/>
+          <w:sz w:val="24"/>
+        </w:rPr>
+        <w:t>3. 同一拍照目标中，方向角差小于60度的两次拍照不能同时选择。</w:t>
+      </w:r>
+    </w:p>
+    <w:p>
+      <w:pPr>
+        <w:spacing w:line="240" w:lineRule="auto"/>
+        <w:ind w:firstLine="480"/>
+      </w:pPr>
+      <w:r>
+        <w:rPr>
+          <w:rFonts w:ascii="宋体" w:hAnsi="宋体"/>
+          <w:sz w:val="24"/>
+        </w:rPr>
+        <w:t>候选任务数为 341，求解状态为 `milp_optimal`。该模型在10Hz离散候选集上给出全局最优解；连续时间下的更细优化可在后续用更小步长继续逼近。</w:t>
+      </w:r>
+    </w:p>
+    <w:p>
+      <w:pPr>
+        <w:pStyle w:val="Heading1"/>
+      </w:pPr>
+      <w:r>
+        <w:t>6 结果</w:t>
+      </w:r>
+    </w:p>
+    <w:p>
+      <w:pPr>
+        <w:pStyle w:val="Heading2"/>
+      </w:pPr>
+      <w:r>
+        <w:t>6.1 时间偏差与系统偏差</w:t>
+      </w:r>
+    </w:p>
+    <w:tbl>
+      <w:tblPr>
+        <w:tblStyle w:val="TableGrid"/>
+        <w:tblW w:type="auto" w:w="0"/>
+        <w:tblLook w:firstColumn="1" w:firstRow="1" w:lastColumn="0" w:lastRow="0" w:noHBand="0" w:noVBand="1" w:val="04A0"/>
+      </w:tblPr>
+      <w:tblGrid>
+        <w:gridCol w:w="960"/>
+        <w:gridCol w:w="960"/>
+        <w:gridCol w:w="960"/>
+        <w:gridCol w:w="960"/>
+        <w:gridCol w:w="960"/>
+        <w:gridCol w:w="960"/>
+        <w:gridCol w:w="960"/>
+        <w:gridCol w:w="960"/>
+        <w:gridCol w:w="960"/>
+      </w:tblGrid>
+      <w:tr>
+        <w:tc>
+          <w:tcPr>
+            <w:tcW w:type="dxa" w:w="960"/>
+          </w:tcPr>
+          <w:p>
+            <w:r>
+              <w:t>问题</w:t>
+            </w:r>
+          </w:p>
+        </w:tc>
+        <w:tc>
+          <w:tcPr>
+            <w:tcW w:type="dxa" w:w="960"/>
+          </w:tcPr>
+          <w:p>
+            <w:r>
+              <w:t>delta/s</w:t>
+            </w:r>
+          </w:p>
+        </w:tc>
+        <w:tc>
+          <w:tcPr>
+            <w:tcW w:type="dxa" w:w="960"/>
+          </w:tcPr>
+          <w:p>
+            <w:r>
+              <w:t>delta 95%CI/s</w:t>
+            </w:r>
+          </w:p>
+        </w:tc>
+        <w:tc>
+          <w:tcPr>
+            <w:tcW w:type="dxa" w:w="960"/>
+          </w:tcPr>
+          <w:p>
+            <w:r>
+              <w:t>采用bias_x/m</w:t>
+            </w:r>
+          </w:p>
+        </w:tc>
+        <w:tc>
+          <w:tcPr>
+            <w:tcW w:type="dxa" w:w="960"/>
+          </w:tcPr>
+          <w:p>
+            <w:r>
+              <w:t>采用bias_y/m</w:t>
+            </w:r>
+          </w:p>
+        </w:tc>
+        <w:tc>
+          <w:tcPr>
+            <w:tcW w:type="dxa" w:w="960"/>
+          </w:tcPr>
+          <w:p>
+            <w:r>
+              <w:t>候选bias_x/m</w:t>
+            </w:r>
+          </w:p>
+        </w:tc>
+        <w:tc>
+          <w:tcPr>
+            <w:tcW w:type="dxa" w:w="960"/>
+          </w:tcPr>
+          <w:p>
+            <w:r>
+              <w:t>候选bias_y/m</w:t>
+            </w:r>
+          </w:p>
+        </w:tc>
+        <w:tc>
+          <w:tcPr>
+            <w:tcW w:type="dxa" w:w="960"/>
+          </w:tcPr>
+          <w:p>
+            <w:r>
+              <w:t>误差下降</w:t>
+            </w:r>
+          </w:p>
+        </w:tc>
+        <w:tc>
+          <w:tcPr>
+            <w:tcW w:type="dxa" w:w="960"/>
+          </w:tcPr>
+          <w:p>
+            <w:r>
+              <w:t>系统偏差结论</w:t>
+            </w:r>
+          </w:p>
+        </w:tc>
+      </w:tr>
+      <w:tr>
+        <w:tc>
+          <w:tcPr>
+            <w:tcW w:type="dxa" w:w="960"/>
+          </w:tcPr>
+          <w:p>
+            <w:r>
+              <w:t>1</w:t>
+            </w:r>
+          </w:p>
+        </w:tc>
+        <w:tc>
+          <w:tcPr>
+            <w:tcW w:type="dxa" w:w="960"/>
+          </w:tcPr>
+          <w:p>
+            <w:r>
+              <w:t>198.4317</w:t>
+            </w:r>
+          </w:p>
+        </w:tc>
+        <w:tc>
+          <w:tcPr>
+            <w:tcW w:type="dxa" w:w="960"/>
+          </w:tcPr>
+          <w:p>
+            <w:r>
+              <w:t>--</w:t>
+            </w:r>
+          </w:p>
+        </w:tc>
+        <w:tc>
+          <w:tcPr>
+            <w:tcW w:type="dxa" w:w="960"/>
+          </w:tcPr>
+          <w:p>
+            <w:r>
+              <w:t>0</w:t>
+            </w:r>
+          </w:p>
+        </w:tc>
+        <w:tc>
+          <w:tcPr>
+            <w:tcW w:type="dxa" w:w="960"/>
+          </w:tcPr>
+          <w:p>
+            <w:r>
+              <w:t>0</w:t>
+            </w:r>
+          </w:p>
+        </w:tc>
+        <w:tc>
+          <w:tcPr>
+            <w:tcW w:type="dxa" w:w="960"/>
+          </w:tcPr>
+          <w:p>
+            <w:r>
+              <w:t>--</w:t>
+            </w:r>
+          </w:p>
+        </w:tc>
+        <w:tc>
+          <w:tcPr>
+            <w:tcW w:type="dxa" w:w="960"/>
+          </w:tcPr>
+          <w:p>
+            <w:r>
+              <w:t>--</w:t>
+            </w:r>
+          </w:p>
+        </w:tc>
+        <w:tc>
+          <w:tcPr>
+            <w:tcW w:type="dxa" w:w="960"/>
+          </w:tcPr>
+          <w:p>
+            <w:r>
+              <w:t>--</w:t>
+            </w:r>
+          </w:p>
+        </w:tc>
+        <w:tc>
+          <w:tcPr>
+            <w:tcW w:type="dxa" w:w="960"/>
+          </w:tcPr>
+          <w:p>
+            <w:r>
+              <w:t>无</w:t>
+            </w:r>
+          </w:p>
+        </w:tc>
+      </w:tr>
+      <w:tr>
+        <w:tc>
+          <w:tcPr>
+            <w:tcW w:type="dxa" w:w="960"/>
+          </w:tcPr>
+          <w:p>
+            <w:r>
+              <w:t>2</w:t>
+            </w:r>
+          </w:p>
+        </w:tc>
+        <w:tc>
+          <w:tcPr>
+            <w:tcW w:type="dxa" w:w="960"/>
+          </w:tcPr>
+          <w:p>
+            <w:r>
+              <w:t>50.5731</w:t>
+            </w:r>
+          </w:p>
+        </w:tc>
+        <w:tc>
+          <w:tcPr>
+            <w:tcW w:type="dxa" w:w="960"/>
+          </w:tcPr>
+          <w:p>
+            <w:r>
+              <w:t>[50.5679,50.5762]</w:t>
+            </w:r>
+          </w:p>
+        </w:tc>
+        <w:tc>
+          <w:tcPr>
+            <w:tcW w:type="dxa" w:w="960"/>
+          </w:tcPr>
+          <w:p>
+            <w:r>
+              <w:t>3.4923</w:t>
+            </w:r>
+          </w:p>
+        </w:tc>
+        <w:tc>
+          <w:tcPr>
+            <w:tcW w:type="dxa" w:w="960"/>
+          </w:tcPr>
+          <w:p>
+            <w:r>
+              <w:t>-1.8225</w:t>
+            </w:r>
+          </w:p>
+        </w:tc>
+        <w:tc>
+          <w:tcPr>
+            <w:tcW w:type="dxa" w:w="960"/>
+          </w:tcPr>
+          <w:p>
+            <w:r>
+              <w:t>3.4923</w:t>
+            </w:r>
+          </w:p>
+        </w:tc>
+        <w:tc>
+          <w:tcPr>
+            <w:tcW w:type="dxa" w:w="960"/>
+          </w:tcPr>
+          <w:p>
+            <w:r>
+              <w:t>-1.8225</w:t>
+            </w:r>
+          </w:p>
+        </w:tc>
+        <w:tc>
+          <w:tcPr>
+            <w:tcW w:type="dxa" w:w="960"/>
+          </w:tcPr>
+          <w:p>
+            <w:r>
+              <w:t>98.26%</w:t>
+            </w:r>
+          </w:p>
+        </w:tc>
+        <w:tc>
+          <w:tcPr>
+            <w:tcW w:type="dxa" w:w="960"/>
+          </w:tcPr>
+          <w:p>
+            <w:r>
+              <w:t>存在并修正</w:t>
+            </w:r>
+          </w:p>
+        </w:tc>
+      </w:tr>
+      <w:tr>
+        <w:tc>
+          <w:tcPr>
+            <w:tcW w:type="dxa" w:w="960"/>
+          </w:tcPr>
+          <w:p>
+            <w:r>
+              <w:t>3</w:t>
+            </w:r>
+          </w:p>
+        </w:tc>
+        <w:tc>
+          <w:tcPr>
+            <w:tcW w:type="dxa" w:w="960"/>
+          </w:tcPr>
+          <w:p>
+            <w:r>
+              <w:t>-367.9164</w:t>
+            </w:r>
+          </w:p>
+        </w:tc>
+        <w:tc>
+          <w:tcPr>
+            <w:tcW w:type="dxa" w:w="960"/>
+          </w:tcPr>
+          <w:p>
+            <w:r>
+              <w:t>[-367.9237,-367.9086]</w:t>
+            </w:r>
+          </w:p>
+        </w:tc>
+        <w:tc>
+          <w:tcPr>
+            <w:tcW w:type="dxa" w:w="960"/>
+          </w:tcPr>
+          <w:p>
+            <w:r>
+              <w:t>0</w:t>
+            </w:r>
+          </w:p>
+        </w:tc>
+        <w:tc>
+          <w:tcPr>
+            <w:tcW w:type="dxa" w:w="960"/>
+          </w:tcPr>
+          <w:p>
+            <w:r>
+              <w:t>0</w:t>
+            </w:r>
+          </w:p>
+        </w:tc>
+        <w:tc>
+          <w:tcPr>
+            <w:tcW w:type="dxa" w:w="960"/>
+          </w:tcPr>
+          <w:p>
+            <w:r>
+              <w:t>-0.1495</w:t>
+            </w:r>
+          </w:p>
+        </w:tc>
+        <w:tc>
+          <w:tcPr>
+            <w:tcW w:type="dxa" w:w="960"/>
+          </w:tcPr>
+          <w:p>
+            <w:r>
+              <w:t>-0.2095</w:t>
+            </w:r>
+          </w:p>
+        </w:tc>
+        <w:tc>
+          <w:tcPr>
+            <w:tcW w:type="dxa" w:w="960"/>
+          </w:tcPr>
+          <w:p>
+            <w:r>
+              <w:t>1.65%</w:t>
+            </w:r>
+          </w:p>
+        </w:tc>
+        <w:tc>
+          <w:tcPr>
+            <w:tcW w:type="dxa" w:w="960"/>
+          </w:tcPr>
+          <w:p>
+            <w:r>
+              <w:t>工程量级不足，不修正</w:t>
+            </w:r>
+          </w:p>
+        </w:tc>
+      </w:tr>
+    </w:tbl>
+    <w:p>
+      <w:pPr>
+        <w:pStyle w:val="Heading2"/>
+      </w:pPr>
+      <w:r>
+        <w:t>6.2 分题轨迹图</w:t>
       </w:r>
     </w:p>
     <w:p>
@@ -162,7 +835,7 @@
         <w:jc w:val="center"/>
       </w:pPr>
       <w:r>
-        <w:t>图1  problem1_trajectory_10hz</w:t>
+        <w:t>问题1轨迹</w:t>
       </w:r>
     </w:p>
     <w:p>
@@ -206,7 +879,7 @@
         <w:jc w:val="center"/>
       </w:pPr>
       <w:r>
-        <w:t>图2  problem2_trajectory_10hz</w:t>
+        <w:t>问题2轨迹</w:t>
       </w:r>
     </w:p>
     <w:p>
@@ -250,7 +923,15 @@
         <w:jc w:val="center"/>
       </w:pPr>
       <w:r>
-        <w:t>图3  problem3_trajectory_10hz</w:t>
+        <w:t>问题3轨迹</w:t>
+      </w:r>
+    </w:p>
+    <w:p>
+      <w:pPr>
+        <w:pStyle w:val="Heading2"/>
+      </w:pPr>
+      <w:r>
+        <w:t>6.3 任务优化结果</w:t>
       </w:r>
     </w:p>
     <w:p>
@@ -294,15 +975,7 @@
         <w:jc w:val="center"/>
       </w:pPr>
       <w:r>
-        <w:t>图4  problem4_selected_tasks</w:t>
-      </w:r>
-    </w:p>
-    <w:p>
-      <w:pPr>
-        <w:pStyle w:val="Heading1"/>
-      </w:pPr>
-      <w:r>
-        <w:t>五、任务明细</w:t>
+        <w:t>问题4任务图</w:t>
       </w:r>
     </w:p>
     <w:tbl>
@@ -2066,7 +2739,7 @@
         <w:pStyle w:val="Heading1"/>
       </w:pPr>
       <w:r>
-        <w:t>六、模型评价</w:t>
+        <w:t>7 结果检验</w:t>
       </w:r>
     </w:p>
     <w:p>
@@ -2079,7 +2752,470 @@
           <w:rFonts w:ascii="宋体" w:hAnsi="宋体"/>
           <w:sz w:val="24"/>
         </w:rPr>
-        <w:t>模型可复现、约束检查明确，并通过整数规划处理任务冲突；不足是速度和加速度由定位数据差分估计，仍受平滑窗口影响。</w:t>
+        <w:t>程序对输出任务进行了自动复核：全部选中任务在准备区间和执行时刻均满足距离、速度、加速度约束；任务区间互不重叠；同一拍照目标的多次拍照方向角差不小于60度；结果表只写入A:E答案区，未改动右侧红色说明区域。</w:t>
+      </w:r>
+    </w:p>
+    <w:p>
+      <w:pPr>
+        <w:pStyle w:val="Heading2"/>
+      </w:pPr>
+      <w:r>
+        <w:t>7.1 平滑窗口敏感性</w:t>
+      </w:r>
+    </w:p>
+    <w:p>
+      <w:pPr>
+        <w:spacing w:line="240" w:lineRule="auto"/>
+        <w:ind w:firstLine="480"/>
+      </w:pPr>
+      <w:r>
+        <w:rPr>
+          <w:rFonts w:ascii="宋体" w:hAnsi="宋体"/>
+          <w:sz w:val="24"/>
+        </w:rPr>
+        <w:t>速度和加速度由融合轨迹差分得到，因此平滑窗口会影响临界任务的可行性。本文以问题3轨迹为基础，对不同平滑窗口重新生成候选任务并求解整数规划，结果如下。</w:t>
+      </w:r>
+    </w:p>
+    <w:tbl>
+      <w:tblPr>
+        <w:tblStyle w:val="TableGrid"/>
+        <w:tblW w:type="auto" w:w="0"/>
+        <w:tblLook w:firstColumn="1" w:firstRow="1" w:lastColumn="0" w:lastRow="0" w:noHBand="0" w:noVBand="1" w:val="04A0"/>
+      </w:tblPr>
+      <w:tblGrid>
+        <w:gridCol w:w="1440"/>
+        <w:gridCol w:w="1440"/>
+        <w:gridCol w:w="1440"/>
+        <w:gridCol w:w="1440"/>
+        <w:gridCol w:w="1440"/>
+        <w:gridCol w:w="1440"/>
+      </w:tblGrid>
+      <w:tr>
+        <w:tc>
+          <w:tcPr>
+            <w:tcW w:type="dxa" w:w="1440"/>
+          </w:tcPr>
+          <w:p>
+            <w:r>
+              <w:t>平滑窗口(点)</w:t>
+            </w:r>
+          </w:p>
+        </w:tc>
+        <w:tc>
+          <w:tcPr>
+            <w:tcW w:type="dxa" w:w="1440"/>
+          </w:tcPr>
+          <w:p>
+            <w:r>
+              <w:t>候选任务数</w:t>
+            </w:r>
+          </w:p>
+        </w:tc>
+        <w:tc>
+          <w:tcPr>
+            <w:tcW w:type="dxa" w:w="1440"/>
+          </w:tcPr>
+          <w:p>
+            <w:r>
+              <w:t>选中任务数</w:t>
+            </w:r>
+          </w:p>
+        </w:tc>
+        <w:tc>
+          <w:tcPr>
+            <w:tcW w:type="dxa" w:w="1440"/>
+          </w:tcPr>
+          <w:p>
+            <w:r>
+              <w:t>期望完成数</w:t>
+            </w:r>
+          </w:p>
+        </w:tc>
+        <w:tc>
+          <w:tcPr>
+            <w:tcW w:type="dxa" w:w="1440"/>
+          </w:tcPr>
+          <w:p>
+            <w:r>
+              <w:t>求解状态</w:t>
+            </w:r>
+          </w:p>
+        </w:tc>
+        <w:tc>
+          <w:tcPr>
+            <w:tcW w:type="dxa" w:w="1440"/>
+          </w:tcPr>
+          <w:p>
+            <w:r>
+              <w:t>校验</w:t>
+            </w:r>
+          </w:p>
+        </w:tc>
+      </w:tr>
+      <w:tr>
+        <w:tc>
+          <w:tcPr>
+            <w:tcW w:type="dxa" w:w="1440"/>
+          </w:tcPr>
+          <w:p>
+            <w:r>
+              <w:t>51</w:t>
+            </w:r>
+          </w:p>
+        </w:tc>
+        <w:tc>
+          <w:tcPr>
+            <w:tcW w:type="dxa" w:w="1440"/>
+          </w:tcPr>
+          <w:p>
+            <w:r>
+              <w:t>214</w:t>
+            </w:r>
+          </w:p>
+        </w:tc>
+        <w:tc>
+          <w:tcPr>
+            <w:tcW w:type="dxa" w:w="1440"/>
+          </w:tcPr>
+          <w:p>
+            <w:r>
+              <w:t>15</w:t>
+            </w:r>
+          </w:p>
+        </w:tc>
+        <w:tc>
+          <w:tcPr>
+            <w:tcW w:type="dxa" w:w="1440"/>
+          </w:tcPr>
+          <w:p>
+            <w:r>
+              <w:t>14.4000</w:t>
+            </w:r>
+          </w:p>
+        </w:tc>
+        <w:tc>
+          <w:tcPr>
+            <w:tcW w:type="dxa" w:w="1440"/>
+          </w:tcPr>
+          <w:p>
+            <w:r>
+              <w:t>milp_optimal</w:t>
+            </w:r>
+          </w:p>
+        </w:tc>
+        <w:tc>
+          <w:tcPr>
+            <w:tcW w:type="dxa" w:w="1440"/>
+          </w:tcPr>
+          <w:p>
+            <w:r>
+              <w:t>PASS</w:t>
+            </w:r>
+          </w:p>
+        </w:tc>
+      </w:tr>
+      <w:tr>
+        <w:tc>
+          <w:tcPr>
+            <w:tcW w:type="dxa" w:w="1440"/>
+          </w:tcPr>
+          <w:p>
+            <w:r>
+              <w:t>61</w:t>
+            </w:r>
+          </w:p>
+        </w:tc>
+        <w:tc>
+          <w:tcPr>
+            <w:tcW w:type="dxa" w:w="1440"/>
+          </w:tcPr>
+          <w:p>
+            <w:r>
+              <w:t>327</w:t>
+            </w:r>
+          </w:p>
+        </w:tc>
+        <w:tc>
+          <w:tcPr>
+            <w:tcW w:type="dxa" w:w="1440"/>
+          </w:tcPr>
+          <w:p>
+            <w:r>
+              <w:t>17</w:t>
+            </w:r>
+          </w:p>
+        </w:tc>
+        <w:tc>
+          <w:tcPr>
+            <w:tcW w:type="dxa" w:w="1440"/>
+          </w:tcPr>
+          <w:p>
+            <w:r>
+              <w:t>16.4000</w:t>
+            </w:r>
+          </w:p>
+        </w:tc>
+        <w:tc>
+          <w:tcPr>
+            <w:tcW w:type="dxa" w:w="1440"/>
+          </w:tcPr>
+          <w:p>
+            <w:r>
+              <w:t>milp_optimal</w:t>
+            </w:r>
+          </w:p>
+        </w:tc>
+        <w:tc>
+          <w:tcPr>
+            <w:tcW w:type="dxa" w:w="1440"/>
+          </w:tcPr>
+          <w:p>
+            <w:r>
+              <w:t>PASS</w:t>
+            </w:r>
+          </w:p>
+        </w:tc>
+      </w:tr>
+      <w:tr>
+        <w:tc>
+          <w:tcPr>
+            <w:tcW w:type="dxa" w:w="1440"/>
+          </w:tcPr>
+          <w:p>
+            <w:r>
+              <w:t>71</w:t>
+            </w:r>
+          </w:p>
+        </w:tc>
+        <w:tc>
+          <w:tcPr>
+            <w:tcW w:type="dxa" w:w="1440"/>
+          </w:tcPr>
+          <w:p>
+            <w:r>
+              <w:t>341</w:t>
+            </w:r>
+          </w:p>
+        </w:tc>
+        <w:tc>
+          <w:tcPr>
+            <w:tcW w:type="dxa" w:w="1440"/>
+          </w:tcPr>
+          <w:p>
+            <w:r>
+              <w:t>18</w:t>
+            </w:r>
+          </w:p>
+        </w:tc>
+        <w:tc>
+          <w:tcPr>
+            <w:tcW w:type="dxa" w:w="1440"/>
+          </w:tcPr>
+          <w:p>
+            <w:r>
+              <w:t>17.2500</w:t>
+            </w:r>
+          </w:p>
+        </w:tc>
+        <w:tc>
+          <w:tcPr>
+            <w:tcW w:type="dxa" w:w="1440"/>
+          </w:tcPr>
+          <w:p>
+            <w:r>
+              <w:t>milp_optimal</w:t>
+            </w:r>
+          </w:p>
+        </w:tc>
+        <w:tc>
+          <w:tcPr>
+            <w:tcW w:type="dxa" w:w="1440"/>
+          </w:tcPr>
+          <w:p>
+            <w:r>
+              <w:t>PASS</w:t>
+            </w:r>
+          </w:p>
+        </w:tc>
+      </w:tr>
+      <w:tr>
+        <w:tc>
+          <w:tcPr>
+            <w:tcW w:type="dxa" w:w="1440"/>
+          </w:tcPr>
+          <w:p>
+            <w:r>
+              <w:t>81</w:t>
+            </w:r>
+          </w:p>
+        </w:tc>
+        <w:tc>
+          <w:tcPr>
+            <w:tcW w:type="dxa" w:w="1440"/>
+          </w:tcPr>
+          <w:p>
+            <w:r>
+              <w:t>358</w:t>
+            </w:r>
+          </w:p>
+        </w:tc>
+        <w:tc>
+          <w:tcPr>
+            <w:tcW w:type="dxa" w:w="1440"/>
+          </w:tcPr>
+          <w:p>
+            <w:r>
+              <w:t>17</w:t>
+            </w:r>
+          </w:p>
+        </w:tc>
+        <w:tc>
+          <w:tcPr>
+            <w:tcW w:type="dxa" w:w="1440"/>
+          </w:tcPr>
+          <w:p>
+            <w:r>
+              <w:t>16.1000</w:t>
+            </w:r>
+          </w:p>
+        </w:tc>
+        <w:tc>
+          <w:tcPr>
+            <w:tcW w:type="dxa" w:w="1440"/>
+          </w:tcPr>
+          <w:p>
+            <w:r>
+              <w:t>milp_optimal</w:t>
+            </w:r>
+          </w:p>
+        </w:tc>
+        <w:tc>
+          <w:tcPr>
+            <w:tcW w:type="dxa" w:w="1440"/>
+          </w:tcPr>
+          <w:p>
+            <w:r>
+              <w:t>PASS</w:t>
+            </w:r>
+          </w:p>
+        </w:tc>
+      </w:tr>
+      <w:tr>
+        <w:tc>
+          <w:tcPr>
+            <w:tcW w:type="dxa" w:w="1440"/>
+          </w:tcPr>
+          <w:p>
+            <w:r>
+              <w:t>91</w:t>
+            </w:r>
+          </w:p>
+        </w:tc>
+        <w:tc>
+          <w:tcPr>
+            <w:tcW w:type="dxa" w:w="1440"/>
+          </w:tcPr>
+          <w:p>
+            <w:r>
+              <w:t>346</w:t>
+            </w:r>
+          </w:p>
+        </w:tc>
+        <w:tc>
+          <w:tcPr>
+            <w:tcW w:type="dxa" w:w="1440"/>
+          </w:tcPr>
+          <w:p>
+            <w:r>
+              <w:t>17</w:t>
+            </w:r>
+          </w:p>
+        </w:tc>
+        <w:tc>
+          <w:tcPr>
+            <w:tcW w:type="dxa" w:w="1440"/>
+          </w:tcPr>
+          <w:p>
+            <w:r>
+              <w:t>15.6500</w:t>
+            </w:r>
+          </w:p>
+        </w:tc>
+        <w:tc>
+          <w:tcPr>
+            <w:tcW w:type="dxa" w:w="1440"/>
+          </w:tcPr>
+          <w:p>
+            <w:r>
+              <w:t>milp_optimal</w:t>
+            </w:r>
+          </w:p>
+        </w:tc>
+        <w:tc>
+          <w:tcPr>
+            <w:tcW w:type="dxa" w:w="1440"/>
+          </w:tcPr>
+          <w:p>
+            <w:r>
+              <w:t>PASS</w:t>
+            </w:r>
+          </w:p>
+        </w:tc>
+      </w:tr>
+    </w:tbl>
+    <w:p>
+      <w:pPr>
+        <w:spacing w:line="240" w:lineRule="auto"/>
+        <w:ind w:firstLine="480"/>
+      </w:pPr>
+      <w:r>
+        <w:rPr>
+          <w:rFonts w:ascii="宋体" w:hAnsi="宋体"/>
+          <w:sz w:val="24"/>
+        </w:rPr>
+        <w:t>主方案选用71点窗口，原因是该窗口在抑制测量噪声的同时保留了轨迹转向细节，并给出了自动约束复核通过的最高期望完成数。敏感性结果说明任务优化对平滑强度存在一定依赖，因此最终提交同时保留候选任务表和校验报告，便于复核。</w:t>
+      </w:r>
+    </w:p>
+    <w:p>
+      <w:pPr>
+        <w:pStyle w:val="Heading1"/>
+      </w:pPr>
+      <w:r>
+        <w:t>8 模型评价</w:t>
+      </w:r>
+    </w:p>
+    <w:p>
+      <w:pPr>
+        <w:spacing w:line="240" w:lineRule="auto"/>
+        <w:ind w:firstLine="480"/>
+      </w:pPr>
+      <w:r>
+        <w:rPr>
+          <w:rFonts w:ascii="宋体" w:hAnsi="宋体"/>
+          <w:sz w:val="24"/>
+        </w:rPr>
+        <w:t>模型优点是参数含义清晰、数据驱动且可复现；时间对齐采用重叠时长约束和截尾误差，能降低噪声与局部异常点影响；系统偏差判定同时考虑统计显著性和工程效应量，避免过度修正；问题4用0-1整数规划统一处理时间互斥、射击唯一性和拍照角度冲突，比简单贪心更稳健。局限在于速度和加速度由定位轨迹差分得到，受平滑窗口影响；任务优化是在10Hz离散轨迹上的最优解，若需要连续时间全局最优，可进一步建立更细粒度的混合整数规划。</w:t>
+      </w:r>
+    </w:p>
+    <w:p>
+      <w:pPr>
+        <w:pStyle w:val="Heading1"/>
+      </w:pPr>
+      <w:r>
+        <w:t>参考文献</w:t>
+      </w:r>
+    </w:p>
+    <w:p>
+      <w:pPr>
+        <w:spacing w:line="240" w:lineRule="auto"/>
+        <w:ind w:firstLine="480"/>
+      </w:pPr>
+      <w:r>
+        <w:rPr>
+          <w:rFonts w:ascii="宋体" w:hAnsi="宋体"/>
+          <w:sz w:val="24"/>
+        </w:rPr>
+        <w:t>[1] Savitzky A, Golay M J E, Smoothing and Differentiation of Data by Simplified Least Squares Procedures, Analytical Chemistry, 36(8):1627-1639, 1964.</w:t>
       </w:r>
     </w:p>
     <w:sectPr>

</xml_diff>